<commit_message>
Sync KT1 speaking script with merged presentation
</commit_message>
<xml_diff>
--- a/docs/lab-01/Текст_выступления_GoCue_КТ1.docx
+++ b/docs/lab-01/Текст_выступления_GoCue_КТ1.docx
@@ -77,7 +77,7 @@
       </w:pPr>
       <w:r>
         <w:rPr/>
-        <w:t>В команде я отвечаю за требования и планирование, Фёдор — за логику приложения, Екатерина — за интерфейс, Магдалина — за уведомления и проверку сценариев. Идея GoCue проста: записать дело, выбрать подходящее место и получить один список дел после подтверждённой остановки, а не сразу при пересечении геозоны.</w:t>
+        <w:t>Внешнего заказчика у нас нет: GoCue — инициативный проект команды. Мы посмотрели на Apple Reminders с напоминаниями по месту и Google Keep/Tasks как инструменты заметок и задач. Наш фокус для Android — подтверждённая остановка, общий список дел и отсутствие дублей. Я отвечаю за требования и план; Фёдор — за правила показа; Екатерина — за экраны; Магдалина — за уведомления и тесты. Наше видение: записать намерение один раз и вернуть его во время подходящего визита.</w:t>
       </w:r>
     </w:p>
     <w:p>
@@ -115,7 +115,7 @@
       </w:pPr>
       <w:r>
         <w:rPr/>
-        <w:t>В MVP входят намерения, выбранные места, подтверждение визита, групповые уведомления и перенос дела на следующий визит. Маршруты, облако и ИИ мы не делаем. Главные технические риски — задержка событий геозоны, ложный сигнал при проезде мимо и дубли после перезапуска. Поэтому сначала проверим правила в симуляторе, потом — на телефоне.</w:t>
+        <w:t>К 12-й неделе восьмого семестра мы хотим показать Android-прототип: запись дела, свой магазин, подтверждённый визит, один сигнал со списком, завершение и перенос на следующий визит. В проект входят локальный журнал и симулятор; маршруты, облако и ИИ не входят. Вехи — логика и симулятор, затем одна реальная геозона и показ. Риски: задержка геозоны, ложный сигнал при проезде, дубль после перезапуска, нехватка времени на нативную разработку и недоверие к геоданным. Сначала проверяем правила без GPS, потом — на Galaxy S25.</w:t>
       </w:r>
     </w:p>
     <w:p>
@@ -126,7 +126,7 @@
       </w:pPr>
       <w:r>
         <w:rPr/>
-        <w:t>На доске создано 18 задач: 14 относятся к ЛР1, четыре — к следующей итерации.</w:t>
+        <w:t>На доске 18 задач, из них 14 — для ЛР1. На 15 октября среди этих четырнадцати три выполнены, две готовы к работе, одна в работе, три на проверке и пять в бэклоге. Даты на слайде — плановые, поэтому мы не выдаём весь список за завершённый.</w:t>
       </w:r>
     </w:p>
     <w:p>
@@ -214,7 +214,7 @@
       </w:pPr>
       <w:r>
         <w:rPr/>
-        <w:t>Технический принцип проекта: логика намерений не работает напрямую с координатами GPS. Система получает событие геозоны, определяет, состоялся ли визит, собирает понятный контекст и только после этого проверяет, какие дела сейчас уместны. Так проще тестировать правила без поездок в магазин и снижать число лишних уведомлений.</w:t>
+        <w:t>В проектных решениях мы зафиксировали нативный Android, локальное хранение без сервера и GitHub Projects как трекер. Библиотеку базы данных и конкретный UI-стек пока не выбирали. Главный архитектурный принцип: логика намерений не получает GPS напрямую. Сначала система подтверждает визит по событию геозоны, затем собирает контекст и определяет подходящие дела. Это позволяет тестировать правила без поездок в магазин и уменьшать число лишних уведомлений.</w:t>
       </w:r>
     </w:p>
     <w:p>

</xml_diff>